<commit_message>
feat(projects): consolidate WWTP project and update title globally
- Standardize project title globally to 'Construction of Wastewater Treatment Plant at Sallaghari, Kodku and Dhobighat' across data models, components, CV files, and metadata
- Consolidate all field works and piling into 5 modular phases under the single flagship WWTP project
- Integrate technical drawings section containing the 2 designated engineering drawings
- Remove obsolete standalone project entries and update layout to featured showcase
</commit_message>
<xml_diff>
--- a/DENISH ADHIKARI CV 2026 new.docx
+++ b/DENISH ADHIKARI CV 2026 new.docx
@@ -329,28 +329,14 @@
           <w:b/>
           <w:bCs/>
         </w:rPr>
-        <w:t>Limited, Tokha</w:t>
+        <w:t>Limited</w:t>
       </w:r>
       <w:r>
         <w:rPr>
           <w:b/>
           <w:bCs/>
         </w:rPr>
-        <w:t>-</w:t>
-      </w:r>
-      <w:r>
-        <w:rPr>
-          <w:b/>
-          <w:bCs/>
-        </w:rPr>
-        <w:t>07, Kathmandu</w:t>
-      </w:r>
-      <w:r>
-        <w:rPr>
-          <w:b/>
-          <w:bCs/>
-        </w:rPr>
-        <w:t>, Nepal</w:t>
+        <w:t xml:space="preserve"> – Project: Construction of Wastewater Treatment Plant at Sallaghari, Kodku and Dhobighat</w:t>
       </w:r>
     </w:p>
     <w:p>

</xml_diff>